<commit_message>
release: finalize TaxGuard 0.9.2
</commit_message>
<xml_diff>
--- a/TaxGuard_User_Manual.docx
+++ b/TaxGuard_User_Manual.docx
@@ -7,12 +7,21 @@
         <w:pStyle w:val="Title"/>
       </w:pPr>
       <w:r>
-        <w:t>TaxGuard System Process Manual</w:t>
+        <w:t>TaxGuard User Manual</w:t>
       </w:r>
     </w:p>
     <w:p>
       <w:r>
-        <w:t>How the company records clients, deadlines, and filings</w:t>
+        <w:rPr>
+          <w:color w:val="2766DB"/>
+          <w:sz w:val="30"/>
+        </w:rPr>
+        <w:t>Local compliance workspace operations</w:t>
+      </w:r>
+    </w:p>
+    <w:p>
+      <w:r>
+        <w:t>Version 0.9.2 | October 2026</w:t>
       </w:r>
     </w:p>
     <w:p>
@@ -23,7 +32,323 @@
         <w:t xml:space="preserve">Purpose. </w:t>
       </w:r>
       <w:r>
-        <w:t>This guide explains the day-to-day workflow in TaxGuard. TaxGuard records filing activity after a return is submitted through the company’s normal external filing channel.</w:t>
+        <w:t>This manual explains how a company team manages clients, filing obligations, supporting documents, reports, users, and local backups in TaxGuard.</w:t>
+      </w:r>
+    </w:p>
+    <w:p>
+      <w:r>
+        <w:t>TaxGuard records filing activity after a return is submitted through the normal external filing channel. It does not prepare or transmit tax returns to BIR.</w:t>
+      </w:r>
+    </w:p>
+    <w:tbl>
+      <w:tblPr>
+        <w:tblW w:type="auto" w:w="0"/>
+        <w:jc w:val="center"/>
+        <w:tblLook w:firstColumn="1" w:firstRow="1" w:lastColumn="0" w:lastRow="0" w:noHBand="0" w:noVBand="1" w:val="04A0"/>
+      </w:tblPr>
+      <w:tblGrid>
+        <w:gridCol w:w="5040"/>
+        <w:gridCol w:w="5040"/>
+      </w:tblGrid>
+      <w:tr>
+        <w:tc>
+          <w:tcPr>
+            <w:tcW w:type="dxa" w:w="5040"/>
+            <w:vAlign w:val="center"/>
+            <w:shd w:fill="123B5D"/>
+            <w:tcBorders>
+              <w:top w:val="single" w:sz="4" w:color="D9D9D9"/>
+              <w:left w:val="single" w:sz="4" w:color="D9D9D9"/>
+              <w:bottom w:val="single" w:sz="4" w:color="D9D9D9"/>
+              <w:right w:val="single" w:sz="4" w:color="D9D9D9"/>
+            </w:tcBorders>
+          </w:tcPr>
+          <w:p>
+            <w:r>
+              <w:rPr>
+                <w:b/>
+                <w:color w:val="FFFFFF"/>
+                <w:sz w:val="18"/>
+              </w:rPr>
+              <w:t>Area</w:t>
+            </w:r>
+          </w:p>
+        </w:tc>
+        <w:tc>
+          <w:tcPr>
+            <w:tcW w:type="dxa" w:w="5040"/>
+            <w:vAlign w:val="center"/>
+            <w:shd w:fill="123B5D"/>
+            <w:tcBorders>
+              <w:top w:val="single" w:sz="4" w:color="D9D9D9"/>
+              <w:left w:val="single" w:sz="4" w:color="D9D9D9"/>
+              <w:bottom w:val="single" w:sz="4" w:color="D9D9D9"/>
+              <w:right w:val="single" w:sz="4" w:color="D9D9D9"/>
+            </w:tcBorders>
+          </w:tcPr>
+          <w:p>
+            <w:r>
+              <w:rPr>
+                <w:b/>
+                <w:color w:val="FFFFFF"/>
+                <w:sz w:val="18"/>
+              </w:rPr>
+              <w:t>Current behavior</w:t>
+            </w:r>
+          </w:p>
+        </w:tc>
+      </w:tr>
+      <w:tr>
+        <w:tc>
+          <w:tcPr>
+            <w:tcW w:type="dxa" w:w="5040"/>
+            <w:vAlign w:val="center"/>
+            <w:tcBorders>
+              <w:top w:val="single" w:sz="4" w:color="D9D9D9"/>
+              <w:left w:val="single" w:sz="4" w:color="D9D9D9"/>
+              <w:bottom w:val="single" w:sz="4" w:color="D9D9D9"/>
+              <w:right w:val="single" w:sz="4" w:color="D9D9D9"/>
+            </w:tcBorders>
+          </w:tcPr>
+          <w:p>
+            <w:r>
+              <w:rPr>
+                <w:sz w:val="18"/>
+              </w:rPr>
+              <w:t>Access</w:t>
+            </w:r>
+          </w:p>
+        </w:tc>
+        <w:tc>
+          <w:tcPr>
+            <w:tcW w:type="dxa" w:w="5040"/>
+            <w:vAlign w:val="center"/>
+            <w:tcBorders>
+              <w:top w:val="single" w:sz="4" w:color="D9D9D9"/>
+              <w:left w:val="single" w:sz="4" w:color="D9D9D9"/>
+              <w:bottom w:val="single" w:sz="4" w:color="D9D9D9"/>
+              <w:right w:val="single" w:sz="4" w:color="D9D9D9"/>
+            </w:tcBorders>
+          </w:tcPr>
+          <w:p>
+            <w:r>
+              <w:rPr>
+                <w:sz w:val="18"/>
+              </w:rPr>
+              <w:t>Desktop app or local XAMPP browser interface.</w:t>
+            </w:r>
+          </w:p>
+        </w:tc>
+      </w:tr>
+      <w:tr>
+        <w:tc>
+          <w:tcPr>
+            <w:tcW w:type="dxa" w:w="5040"/>
+            <w:vAlign w:val="center"/>
+            <w:tcBorders>
+              <w:top w:val="single" w:sz="4" w:color="D9D9D9"/>
+              <w:left w:val="single" w:sz="4" w:color="D9D9D9"/>
+              <w:bottom w:val="single" w:sz="4" w:color="D9D9D9"/>
+              <w:right w:val="single" w:sz="4" w:color="D9D9D9"/>
+            </w:tcBorders>
+            <w:shd w:fill="F3F7FB"/>
+          </w:tcPr>
+          <w:p>
+            <w:r>
+              <w:rPr>
+                <w:sz w:val="18"/>
+              </w:rPr>
+              <w:t>Storage</w:t>
+            </w:r>
+          </w:p>
+        </w:tc>
+        <w:tc>
+          <w:tcPr>
+            <w:tcW w:type="dxa" w:w="5040"/>
+            <w:vAlign w:val="center"/>
+            <w:tcBorders>
+              <w:top w:val="single" w:sz="4" w:color="D9D9D9"/>
+              <w:left w:val="single" w:sz="4" w:color="D9D9D9"/>
+              <w:bottom w:val="single" w:sz="4" w:color="D9D9D9"/>
+              <w:right w:val="single" w:sz="4" w:color="D9D9D9"/>
+            </w:tcBorders>
+            <w:shd w:fill="F3F7FB"/>
+          </w:tcPr>
+          <w:p>
+            <w:r>
+              <w:rPr>
+                <w:sz w:val="18"/>
+              </w:rPr>
+              <w:t>Local SQLite database shared by the development desktop and localhost interfaces.</w:t>
+            </w:r>
+          </w:p>
+        </w:tc>
+      </w:tr>
+      <w:tr>
+        <w:tc>
+          <w:tcPr>
+            <w:tcW w:type="dxa" w:w="5040"/>
+            <w:vAlign w:val="center"/>
+            <w:tcBorders>
+              <w:top w:val="single" w:sz="4" w:color="D9D9D9"/>
+              <w:left w:val="single" w:sz="4" w:color="D9D9D9"/>
+              <w:bottom w:val="single" w:sz="4" w:color="D9D9D9"/>
+              <w:right w:val="single" w:sz="4" w:color="D9D9D9"/>
+            </w:tcBorders>
+          </w:tcPr>
+          <w:p>
+            <w:r>
+              <w:rPr>
+                <w:sz w:val="18"/>
+              </w:rPr>
+              <w:t>Accounts</w:t>
+            </w:r>
+          </w:p>
+        </w:tc>
+        <w:tc>
+          <w:tcPr>
+            <w:tcW w:type="dxa" w:w="5040"/>
+            <w:vAlign w:val="center"/>
+            <w:tcBorders>
+              <w:top w:val="single" w:sz="4" w:color="D9D9D9"/>
+              <w:left w:val="single" w:sz="4" w:color="D9D9D9"/>
+              <w:bottom w:val="single" w:sz="4" w:color="D9D9D9"/>
+              <w:right w:val="single" w:sz="4" w:color="D9D9D9"/>
+            </w:tcBorders>
+          </w:tcPr>
+          <w:p>
+            <w:r>
+              <w:rPr>
+                <w:sz w:val="18"/>
+              </w:rPr>
+              <w:t>First-run administrator setup, session expiry, and role-based access.</w:t>
+            </w:r>
+          </w:p>
+        </w:tc>
+      </w:tr>
+      <w:tr>
+        <w:tc>
+          <w:tcPr>
+            <w:tcW w:type="dxa" w:w="5040"/>
+            <w:vAlign w:val="center"/>
+            <w:tcBorders>
+              <w:top w:val="single" w:sz="4" w:color="D9D9D9"/>
+              <w:left w:val="single" w:sz="4" w:color="D9D9D9"/>
+              <w:bottom w:val="single" w:sz="4" w:color="D9D9D9"/>
+              <w:right w:val="single" w:sz="4" w:color="D9D9D9"/>
+            </w:tcBorders>
+            <w:shd w:fill="F3F7FB"/>
+          </w:tcPr>
+          <w:p>
+            <w:r>
+              <w:rPr>
+                <w:sz w:val="18"/>
+              </w:rPr>
+              <w:t>Transfers</w:t>
+            </w:r>
+          </w:p>
+        </w:tc>
+        <w:tc>
+          <w:tcPr>
+            <w:tcW w:type="dxa" w:w="5040"/>
+            <w:vAlign w:val="center"/>
+            <w:tcBorders>
+              <w:top w:val="single" w:sz="4" w:color="D9D9D9"/>
+              <w:left w:val="single" w:sz="4" w:color="D9D9D9"/>
+              <w:bottom w:val="single" w:sz="4" w:color="D9D9D9"/>
+              <w:right w:val="single" w:sz="4" w:color="D9D9D9"/>
+            </w:tcBorders>
+            <w:shd w:fill="F3F7FB"/>
+          </w:tcPr>
+          <w:p>
+            <w:r>
+              <w:rPr>
+                <w:sz w:val="18"/>
+              </w:rPr>
+              <w:t>Client and filing Excel transfer; complete SQLite backup and restore.</w:t>
+            </w:r>
+          </w:p>
+        </w:tc>
+      </w:tr>
+      <w:tr>
+        <w:tc>
+          <w:tcPr>
+            <w:tcW w:type="dxa" w:w="5040"/>
+            <w:vAlign w:val="center"/>
+            <w:tcBorders>
+              <w:top w:val="single" w:sz="4" w:color="D9D9D9"/>
+              <w:left w:val="single" w:sz="4" w:color="D9D9D9"/>
+              <w:bottom w:val="single" w:sz="4" w:color="D9D9D9"/>
+              <w:right w:val="single" w:sz="4" w:color="D9D9D9"/>
+            </w:tcBorders>
+          </w:tcPr>
+          <w:p>
+            <w:r>
+              <w:rPr>
+                <w:sz w:val="18"/>
+              </w:rPr>
+              <w:t>Deadlines</w:t>
+            </w:r>
+          </w:p>
+        </w:tc>
+        <w:tc>
+          <w:tcPr>
+            <w:tcW w:type="dxa" w:w="5040"/>
+            <w:vAlign w:val="center"/>
+            <w:tcBorders>
+              <w:top w:val="single" w:sz="4" w:color="D9D9D9"/>
+              <w:left w:val="single" w:sz="4" w:color="D9D9D9"/>
+              <w:bottom w:val="single" w:sz="4" w:color="D9D9D9"/>
+              <w:right w:val="single" w:sz="4" w:color="D9D9D9"/>
+            </w:tcBorders>
+          </w:tcPr>
+          <w:p>
+            <w:r>
+              <w:rPr>
+                <w:sz w:val="18"/>
+              </w:rPr>
+              <w:t>Weekend adjustment plus administrator-entered holidays and sourced extensions.</w:t>
+            </w:r>
+          </w:p>
+        </w:tc>
+      </w:tr>
+    </w:tbl>
+    <w:p/>
+    <w:p>
+      <w:pPr>
+        <w:pStyle w:val="Heading1"/>
+      </w:pPr>
+      <w:r>
+        <w:t>1  First-time setup and sign-in</w:t>
+      </w:r>
+    </w:p>
+    <w:p>
+      <w:pPr>
+        <w:pStyle w:val="ListNumber"/>
+      </w:pPr>
+      <w:r>
+        <w:t>Open TaxGuard. A new database displays Set Up TaxGuard.</w:t>
+      </w:r>
+    </w:p>
+    <w:p>
+      <w:pPr>
+        <w:pStyle w:val="ListNumber"/>
+      </w:pPr>
+      <w:r>
+        <w:t>Enter the company name and create the first administrator username and password.</w:t>
+      </w:r>
+    </w:p>
+    <w:p>
+      <w:pPr>
+        <w:pStyle w:val="ListNumber"/>
+      </w:pPr>
+      <w:r>
+        <w:t>Sign in with the new account. TaxGuard does not provide a default password.</w:t>
+      </w:r>
+    </w:p>
+    <w:p>
+      <w:r>
+        <w:t>Sessions expire after 30 minutes without activity and are revoked on sign-out. Sign-out clears the visible credential fields.</w:t>
       </w:r>
     </w:p>
     <w:p>
@@ -31,12 +356,417 @@
         <w:pStyle w:val="Heading1"/>
       </w:pPr>
       <w:r>
-        <w:t>The system process</w:t>
+        <w:t>2  Roles and navigation</w:t>
+      </w:r>
+    </w:p>
+    <w:tbl>
+      <w:tblPr>
+        <w:tblW w:type="auto" w:w="0"/>
+        <w:jc w:val="center"/>
+        <w:tblLook w:firstColumn="1" w:firstRow="1" w:lastColumn="0" w:lastRow="0" w:noHBand="0" w:noVBand="1" w:val="04A0"/>
+      </w:tblPr>
+      <w:tblGrid>
+        <w:gridCol w:w="5040"/>
+        <w:gridCol w:w="5040"/>
+      </w:tblGrid>
+      <w:tr>
+        <w:tc>
+          <w:tcPr>
+            <w:tcW w:type="dxa" w:w="5040"/>
+            <w:vAlign w:val="center"/>
+            <w:shd w:fill="123B5D"/>
+            <w:tcBorders>
+              <w:top w:val="single" w:sz="4" w:color="D9D9D9"/>
+              <w:left w:val="single" w:sz="4" w:color="D9D9D9"/>
+              <w:bottom w:val="single" w:sz="4" w:color="D9D9D9"/>
+              <w:right w:val="single" w:sz="4" w:color="D9D9D9"/>
+            </w:tcBorders>
+          </w:tcPr>
+          <w:p>
+            <w:r>
+              <w:rPr>
+                <w:b/>
+                <w:color w:val="FFFFFF"/>
+                <w:sz w:val="18"/>
+              </w:rPr>
+              <w:t>Role or area</w:t>
+            </w:r>
+          </w:p>
+        </w:tc>
+        <w:tc>
+          <w:tcPr>
+            <w:tcW w:type="dxa" w:w="5040"/>
+            <w:vAlign w:val="center"/>
+            <w:shd w:fill="123B5D"/>
+            <w:tcBorders>
+              <w:top w:val="single" w:sz="4" w:color="D9D9D9"/>
+              <w:left w:val="single" w:sz="4" w:color="D9D9D9"/>
+              <w:bottom w:val="single" w:sz="4" w:color="D9D9D9"/>
+              <w:right w:val="single" w:sz="4" w:color="D9D9D9"/>
+            </w:tcBorders>
+          </w:tcPr>
+          <w:p>
+            <w:r>
+              <w:rPr>
+                <w:b/>
+                <w:color w:val="FFFFFF"/>
+                <w:sz w:val="18"/>
+              </w:rPr>
+              <w:t>Purpose</w:t>
+            </w:r>
+          </w:p>
+        </w:tc>
+      </w:tr>
+      <w:tr>
+        <w:tc>
+          <w:tcPr>
+            <w:tcW w:type="dxa" w:w="5040"/>
+            <w:vAlign w:val="center"/>
+            <w:tcBorders>
+              <w:top w:val="single" w:sz="4" w:color="D9D9D9"/>
+              <w:left w:val="single" w:sz="4" w:color="D9D9D9"/>
+              <w:bottom w:val="single" w:sz="4" w:color="D9D9D9"/>
+              <w:right w:val="single" w:sz="4" w:color="D9D9D9"/>
+            </w:tcBorders>
+          </w:tcPr>
+          <w:p>
+            <w:r>
+              <w:rPr>
+                <w:sz w:val="18"/>
+              </w:rPr>
+              <w:t>Administrator</w:t>
+            </w:r>
+          </w:p>
+        </w:tc>
+        <w:tc>
+          <w:tcPr>
+            <w:tcW w:type="dxa" w:w="5040"/>
+            <w:vAlign w:val="center"/>
+            <w:tcBorders>
+              <w:top w:val="single" w:sz="4" w:color="D9D9D9"/>
+              <w:left w:val="single" w:sz="4" w:color="D9D9D9"/>
+              <w:bottom w:val="single" w:sz="4" w:color="D9D9D9"/>
+              <w:right w:val="single" w:sz="4" w:color="D9D9D9"/>
+            </w:tcBorders>
+          </w:tcPr>
+          <w:p>
+            <w:r>
+              <w:rPr>
+                <w:sz w:val="18"/>
+              </w:rPr>
+              <w:t>Manage users, company profile, custom fields, schedules, calendar rules, imports, restore, and audit records.</w:t>
+            </w:r>
+          </w:p>
+        </w:tc>
+      </w:tr>
+      <w:tr>
+        <w:tc>
+          <w:tcPr>
+            <w:tcW w:type="dxa" w:w="5040"/>
+            <w:vAlign w:val="center"/>
+            <w:tcBorders>
+              <w:top w:val="single" w:sz="4" w:color="D9D9D9"/>
+              <w:left w:val="single" w:sz="4" w:color="D9D9D9"/>
+              <w:bottom w:val="single" w:sz="4" w:color="D9D9D9"/>
+              <w:right w:val="single" w:sz="4" w:color="D9D9D9"/>
+            </w:tcBorders>
+            <w:shd w:fill="F3F7FB"/>
+          </w:tcPr>
+          <w:p>
+            <w:r>
+              <w:rPr>
+                <w:sz w:val="18"/>
+              </w:rPr>
+              <w:t>Staff roles</w:t>
+            </w:r>
+          </w:p>
+        </w:tc>
+        <w:tc>
+          <w:tcPr>
+            <w:tcW w:type="dxa" w:w="5040"/>
+            <w:vAlign w:val="center"/>
+            <w:tcBorders>
+              <w:top w:val="single" w:sz="4" w:color="D9D9D9"/>
+              <w:left w:val="single" w:sz="4" w:color="D9D9D9"/>
+              <w:bottom w:val="single" w:sz="4" w:color="D9D9D9"/>
+              <w:right w:val="single" w:sz="4" w:color="D9D9D9"/>
+            </w:tcBorders>
+            <w:shd w:fill="F3F7FB"/>
+          </w:tcPr>
+          <w:p>
+            <w:r>
+              <w:rPr>
+                <w:sz w:val="18"/>
+              </w:rPr>
+              <w:t>Work with clients, filings, documents, reports, exports, and backup creation.</w:t>
+            </w:r>
+          </w:p>
+        </w:tc>
+      </w:tr>
+      <w:tr>
+        <w:tc>
+          <w:tcPr>
+            <w:tcW w:type="dxa" w:w="5040"/>
+            <w:vAlign w:val="center"/>
+            <w:tcBorders>
+              <w:top w:val="single" w:sz="4" w:color="D9D9D9"/>
+              <w:left w:val="single" w:sz="4" w:color="D9D9D9"/>
+              <w:bottom w:val="single" w:sz="4" w:color="D9D9D9"/>
+              <w:right w:val="single" w:sz="4" w:color="D9D9D9"/>
+            </w:tcBorders>
+          </w:tcPr>
+          <w:p>
+            <w:r>
+              <w:rPr>
+                <w:sz w:val="18"/>
+              </w:rPr>
+              <w:t>Overview</w:t>
+            </w:r>
+          </w:p>
+        </w:tc>
+        <w:tc>
+          <w:tcPr>
+            <w:tcW w:type="dxa" w:w="5040"/>
+            <w:vAlign w:val="center"/>
+            <w:tcBorders>
+              <w:top w:val="single" w:sz="4" w:color="D9D9D9"/>
+              <w:left w:val="single" w:sz="4" w:color="D9D9D9"/>
+              <w:bottom w:val="single" w:sz="4" w:color="D9D9D9"/>
+              <w:right w:val="single" w:sz="4" w:color="D9D9D9"/>
+            </w:tcBorders>
+          </w:tcPr>
+          <w:p>
+            <w:r>
+              <w:rPr>
+                <w:sz w:val="18"/>
+              </w:rPr>
+              <w:t>Review yearly totals, risk groups, progress by form, and recent filings.</w:t>
+            </w:r>
+          </w:p>
+        </w:tc>
+      </w:tr>
+      <w:tr>
+        <w:tc>
+          <w:tcPr>
+            <w:tcW w:type="dxa" w:w="5040"/>
+            <w:vAlign w:val="center"/>
+            <w:tcBorders>
+              <w:top w:val="single" w:sz="4" w:color="D9D9D9"/>
+              <w:left w:val="single" w:sz="4" w:color="D9D9D9"/>
+              <w:bottom w:val="single" w:sz="4" w:color="D9D9D9"/>
+              <w:right w:val="single" w:sz="4" w:color="D9D9D9"/>
+            </w:tcBorders>
+            <w:shd w:fill="F3F7FB"/>
+          </w:tcPr>
+          <w:p>
+            <w:r>
+              <w:rPr>
+                <w:sz w:val="18"/>
+              </w:rPr>
+              <w:t>Client directory</w:t>
+            </w:r>
+          </w:p>
+        </w:tc>
+        <w:tc>
+          <w:tcPr>
+            <w:tcW w:type="dxa" w:w="5040"/>
+            <w:vAlign w:val="center"/>
+            <w:tcBorders>
+              <w:top w:val="single" w:sz="4" w:color="D9D9D9"/>
+              <w:left w:val="single" w:sz="4" w:color="D9D9D9"/>
+              <w:bottom w:val="single" w:sz="4" w:color="D9D9D9"/>
+              <w:right w:val="single" w:sz="4" w:color="D9D9D9"/>
+            </w:tcBorders>
+            <w:shd w:fill="F3F7FB"/>
+          </w:tcPr>
+          <w:p>
+            <w:r>
+              <w:rPr>
+                <w:sz w:val="18"/>
+              </w:rPr>
+              <w:t>Create, search, filter, edit, pull out, and pull in clients.</w:t>
+            </w:r>
+          </w:p>
+        </w:tc>
+      </w:tr>
+      <w:tr>
+        <w:tc>
+          <w:tcPr>
+            <w:tcW w:type="dxa" w:w="5040"/>
+            <w:vAlign w:val="center"/>
+            <w:tcBorders>
+              <w:top w:val="single" w:sz="4" w:color="D9D9D9"/>
+              <w:left w:val="single" w:sz="4" w:color="D9D9D9"/>
+              <w:bottom w:val="single" w:sz="4" w:color="D9D9D9"/>
+              <w:right w:val="single" w:sz="4" w:color="D9D9D9"/>
+            </w:tcBorders>
+          </w:tcPr>
+          <w:p>
+            <w:r>
+              <w:rPr>
+                <w:sz w:val="18"/>
+              </w:rPr>
+              <w:t>Compliance tracker</w:t>
+            </w:r>
+          </w:p>
+        </w:tc>
+        <w:tc>
+          <w:tcPr>
+            <w:tcW w:type="dxa" w:w="5040"/>
+            <w:vAlign w:val="center"/>
+            <w:tcBorders>
+              <w:top w:val="single" w:sz="4" w:color="D9D9D9"/>
+              <w:left w:val="single" w:sz="4" w:color="D9D9D9"/>
+              <w:bottom w:val="single" w:sz="4" w:color="D9D9D9"/>
+              <w:right w:val="single" w:sz="4" w:color="D9D9D9"/>
+            </w:tcBorders>
+          </w:tcPr>
+          <w:p>
+            <w:r>
+              <w:rPr>
+                <w:sz w:val="18"/>
+              </w:rPr>
+              <w:t>Filter obligations and record or review filings.</w:t>
+            </w:r>
+          </w:p>
+        </w:tc>
+      </w:tr>
+      <w:tr>
+        <w:tc>
+          <w:tcPr>
+            <w:tcW w:type="dxa" w:w="5040"/>
+            <w:vAlign w:val="center"/>
+            <w:tcBorders>
+              <w:top w:val="single" w:sz="4" w:color="D9D9D9"/>
+              <w:left w:val="single" w:sz="4" w:color="D9D9D9"/>
+              <w:bottom w:val="single" w:sz="4" w:color="D9D9D9"/>
+              <w:right w:val="single" w:sz="4" w:color="D9D9D9"/>
+            </w:tcBorders>
+            <w:shd w:fill="F3F7FB"/>
+          </w:tcPr>
+          <w:p>
+            <w:r>
+              <w:rPr>
+                <w:sz w:val="18"/>
+              </w:rPr>
+              <w:t>Deadline reference</w:t>
+            </w:r>
+          </w:p>
+        </w:tc>
+        <w:tc>
+          <w:tcPr>
+            <w:tcW w:type="dxa" w:w="5040"/>
+            <w:vAlign w:val="center"/>
+            <w:tcBorders>
+              <w:top w:val="single" w:sz="4" w:color="D9D9D9"/>
+              <w:left w:val="single" w:sz="4" w:color="D9D9D9"/>
+              <w:bottom w:val="single" w:sz="4" w:color="D9D9D9"/>
+              <w:right w:val="single" w:sz="4" w:color="D9D9D9"/>
+            </w:tcBorders>
+            <w:shd w:fill="F3F7FB"/>
+          </w:tcPr>
+          <w:p>
+            <w:r>
+              <w:rPr>
+                <w:sz w:val="18"/>
+              </w:rPr>
+              <w:t>Maintain form schedules, holidays, overrides, and extensions.</w:t>
+            </w:r>
+          </w:p>
+        </w:tc>
+      </w:tr>
+      <w:tr>
+        <w:tc>
+          <w:tcPr>
+            <w:tcW w:type="dxa" w:w="5040"/>
+            <w:vAlign w:val="center"/>
+            <w:tcBorders>
+              <w:top w:val="single" w:sz="4" w:color="D9D9D9"/>
+              <w:left w:val="single" w:sz="4" w:color="D9D9D9"/>
+              <w:bottom w:val="single" w:sz="4" w:color="D9D9D9"/>
+              <w:right w:val="single" w:sz="4" w:color="D9D9D9"/>
+            </w:tcBorders>
+          </w:tcPr>
+          <w:p>
+            <w:r>
+              <w:rPr>
+                <w:sz w:val="18"/>
+              </w:rPr>
+              <w:t>Settings</w:t>
+            </w:r>
+          </w:p>
+        </w:tc>
+        <w:tc>
+          <w:tcPr>
+            <w:tcW w:type="dxa" w:w="5040"/>
+            <w:vAlign w:val="center"/>
+            <w:tcBorders>
+              <w:top w:val="single" w:sz="4" w:color="D9D9D9"/>
+              <w:left w:val="single" w:sz="4" w:color="D9D9D9"/>
+              <w:bottom w:val="single" w:sz="4" w:color="D9D9D9"/>
+              <w:right w:val="single" w:sz="4" w:color="D9D9D9"/>
+            </w:tcBorders>
+          </w:tcPr>
+          <w:p>
+            <w:r>
+              <w:rPr>
+                <w:sz w:val="18"/>
+              </w:rPr>
+              <w:t>Manage company details, users, fields, reports, transfers, backups, and audit records.</w:t>
+            </w:r>
+          </w:p>
+        </w:tc>
+      </w:tr>
+    </w:tbl>
+    <w:p/>
+    <w:p>
+      <w:pPr>
+        <w:pStyle w:val="Heading1"/>
+      </w:pPr>
+      <w:r>
+        <w:t>3  Manage clients and yearly requirements</w:t>
+      </w:r>
+    </w:p>
+    <w:p>
+      <w:pPr>
+        <w:pStyle w:val="ListNumber"/>
+      </w:pPr>
+      <w:r>
+        <w:t>Open Client directory and choose Add client.</w:t>
+      </w:r>
+    </w:p>
+    <w:p>
+      <w:pPr>
+        <w:pStyle w:val="ListNumber"/>
+      </w:pPr>
+      <w:r>
+        <w:t>Enter the name, unique TIN, business type, tax type, filing start date, and profile details.</w:t>
+      </w:r>
+    </w:p>
+    <w:p>
+      <w:pPr>
+        <w:pStyle w:val="ListNumber"/>
+      </w:pPr>
+      <w:r>
+        <w:t>Select the required BIR forms and save after reviewing the confirmation.</w:t>
       </w:r>
     </w:p>
     <w:p>
       <w:r>
-        <w:t>Client setup creates the master record. Required forms determine the obligations. Deadline references provide periods and due dates. The compliance tracker shows what is incomplete, overdue, or complete. Recording a submission updates the tracker and dashboard.</w:t>
+        <w:t>Recurring requirements carry into later years automatically. Year-specific registration choices can change without rewriting earlier history. Year history begins with the first applicable filing year; earlier empty years are omitted.</w:t>
+      </w:r>
+    </w:p>
+    <w:p>
+      <w:pPr>
+        <w:pStyle w:val="Heading2"/>
+      </w:pPr>
+      <w:r>
+        <w:t>Pullout and resumed service</w:t>
+      </w:r>
+    </w:p>
+    <w:p>
+      <w:r>
+        <w:t>Pull out records the last service day. Historical filings remain while later unfiled periods are excluded. Pull in records the first resumed-service day and restores later obligations while retaining the service gap.</w:t>
       </w:r>
     </w:p>
     <w:p>
@@ -44,17 +774,17 @@
         <w:pStyle w:val="Heading1"/>
       </w:pPr>
       <w:r>
-        <w:t>1  Create a client</w:t>
+        <w:t>4  Maintain deadline references</w:t>
       </w:r>
     </w:p>
     <w:p>
       <w:r>
-        <w:t>Open Client directory and choose Add client. Enter the client name, TIN, start of filing date, business type, tax type, and status. Select every required form; selected forms appear as pills. Add remarks if needed, then choose Save client.</w:t>
+        <w:t>Schedules define monthly, quarterly, and annual obligations. Period terms use controlled choices. Weekend dates move to the next working day. Administrators can add holidays and sourced BIR extensions, or apply an exact manual override.</w:t>
       </w:r>
     </w:p>
     <w:p>
       <w:r>
-        <w:t>The TIN must use 000-000-000-000 format and be unique. Required values and dates are validated before saving.</w:t>
+        <w:t>TaxGuard does not fetch official circulars automatically. Verify schedules, holidays, and extensions against current official BIR guidance.</w:t>
       </w:r>
     </w:p>
     <w:p>
@@ -62,12 +792,344 @@
         <w:pStyle w:val="Heading1"/>
       </w:pPr>
       <w:r>
-        <w:t>2  Review or edit a client</w:t>
+        <w:t>5  Record filings and documents</w:t>
+      </w:r>
+    </w:p>
+    <w:p>
+      <w:pPr>
+        <w:pStyle w:val="ListNumber"/>
+      </w:pPr>
+      <w:r>
+        <w:t>Open Compliance tracker, select the year, and filter to the obligation.</w:t>
+      </w:r>
+    </w:p>
+    <w:p>
+      <w:pPr>
+        <w:pStyle w:val="ListNumber"/>
+      </w:pPr>
+      <w:r>
+        <w:t>Open the filing window from the row or client details.</w:t>
+      </w:r>
+    </w:p>
+    <w:p>
+      <w:pPr>
+        <w:pStyle w:val="ListNumber"/>
+      </w:pPr>
+      <w:r>
+        <w:t>Enter the filing date, confirmation or reference number, and optional remarks.</w:t>
+      </w:r>
+    </w:p>
+    <w:p>
+      <w:pPr>
+        <w:pStyle w:val="ListNumber"/>
+      </w:pPr>
+      <w:r>
+        <w:t>Optionally attach a PDF, PNG, JPEG, or WebP copy up to 5 MB.</w:t>
+      </w:r>
+    </w:p>
+    <w:p>
+      <w:pPr>
+        <w:pStyle w:val="ListNumber"/>
+      </w:pPr>
+      <w:r>
+        <w:t>Review the confirmation and save. Dashboard and client progress update immediately.</w:t>
       </w:r>
     </w:p>
     <w:p>
       <w:r>
-        <w:t>Search Client directory by client name or TIN. Click a row to open the client details. Choose Edit inside the detail window, update the values, and save. Changing required forms changes the client’s generated obligations.</w:t>
+        <w:t>A due date in the next calendar year is filed from the correct filing year. Uploaded content must match its declared file type.</w:t>
+      </w:r>
+    </w:p>
+    <w:tbl>
+      <w:tblPr>
+        <w:tblW w:type="auto" w:w="0"/>
+        <w:jc w:val="center"/>
+        <w:tblLook w:firstColumn="1" w:firstRow="1" w:lastColumn="0" w:lastRow="0" w:noHBand="0" w:noVBand="1" w:val="04A0"/>
+      </w:tblPr>
+      <w:tblGrid>
+        <w:gridCol w:w="5040"/>
+        <w:gridCol w:w="5040"/>
+      </w:tblGrid>
+      <w:tr>
+        <w:tc>
+          <w:tcPr>
+            <w:tcW w:type="dxa" w:w="5040"/>
+            <w:vAlign w:val="center"/>
+            <w:shd w:fill="123B5D"/>
+            <w:tcBorders>
+              <w:top w:val="single" w:sz="4" w:color="D9D9D9"/>
+              <w:left w:val="single" w:sz="4" w:color="D9D9D9"/>
+              <w:bottom w:val="single" w:sz="4" w:color="D9D9D9"/>
+              <w:right w:val="single" w:sz="4" w:color="D9D9D9"/>
+            </w:tcBorders>
+          </w:tcPr>
+          <w:p>
+            <w:r>
+              <w:rPr>
+                <w:b/>
+                <w:color w:val="FFFFFF"/>
+                <w:sz w:val="18"/>
+              </w:rPr>
+              <w:t>Status</w:t>
+            </w:r>
+          </w:p>
+        </w:tc>
+        <w:tc>
+          <w:tcPr>
+            <w:tcW w:type="dxa" w:w="5040"/>
+            <w:vAlign w:val="center"/>
+            <w:shd w:fill="123B5D"/>
+            <w:tcBorders>
+              <w:top w:val="single" w:sz="4" w:color="D9D9D9"/>
+              <w:left w:val="single" w:sz="4" w:color="D9D9D9"/>
+              <w:bottom w:val="single" w:sz="4" w:color="D9D9D9"/>
+              <w:right w:val="single" w:sz="4" w:color="D9D9D9"/>
+            </w:tcBorders>
+          </w:tcPr>
+          <w:p>
+            <w:r>
+              <w:rPr>
+                <w:b/>
+                <w:color w:val="FFFFFF"/>
+                <w:sz w:val="18"/>
+              </w:rPr>
+              <w:t>Meaning</w:t>
+            </w:r>
+          </w:p>
+        </w:tc>
+      </w:tr>
+      <w:tr>
+        <w:tc>
+          <w:tcPr>
+            <w:tcW w:type="dxa" w:w="5040"/>
+            <w:vAlign w:val="center"/>
+            <w:tcBorders>
+              <w:top w:val="single" w:sz="4" w:color="D9D9D9"/>
+              <w:left w:val="single" w:sz="4" w:color="D9D9D9"/>
+              <w:bottom w:val="single" w:sz="4" w:color="D9D9D9"/>
+              <w:right w:val="single" w:sz="4" w:color="D9D9D9"/>
+            </w:tcBorders>
+          </w:tcPr>
+          <w:p>
+            <w:r>
+              <w:rPr>
+                <w:sz w:val="18"/>
+              </w:rPr>
+              <w:t>Complete</w:t>
+            </w:r>
+          </w:p>
+        </w:tc>
+        <w:tc>
+          <w:tcPr>
+            <w:tcW w:type="dxa" w:w="5040"/>
+            <w:vAlign w:val="center"/>
+            <w:tcBorders>
+              <w:top w:val="single" w:sz="4" w:color="D9D9D9"/>
+              <w:left w:val="single" w:sz="4" w:color="D9D9D9"/>
+              <w:bottom w:val="single" w:sz="4" w:color="D9D9D9"/>
+              <w:right w:val="single" w:sz="4" w:color="D9D9D9"/>
+            </w:tcBorders>
+          </w:tcPr>
+          <w:p>
+            <w:r>
+              <w:rPr>
+                <w:sz w:val="18"/>
+              </w:rPr>
+              <w:t>Every applicable obligation has a saved filing.</w:t>
+            </w:r>
+          </w:p>
+        </w:tc>
+      </w:tr>
+      <w:tr>
+        <w:tc>
+          <w:tcPr>
+            <w:tcW w:type="dxa" w:w="5040"/>
+            <w:vAlign w:val="center"/>
+            <w:tcBorders>
+              <w:top w:val="single" w:sz="4" w:color="D9D9D9"/>
+              <w:left w:val="single" w:sz="4" w:color="D9D9D9"/>
+              <w:bottom w:val="single" w:sz="4" w:color="D9D9D9"/>
+              <w:right w:val="single" w:sz="4" w:color="D9D9D9"/>
+            </w:tcBorders>
+            <w:shd w:fill="F3F7FB"/>
+          </w:tcPr>
+          <w:p>
+            <w:r>
+              <w:rPr>
+                <w:sz w:val="18"/>
+              </w:rPr>
+              <w:t>Pending</w:t>
+            </w:r>
+          </w:p>
+        </w:tc>
+        <w:tc>
+          <w:tcPr>
+            <w:tcW w:type="dxa" w:w="5040"/>
+            <w:vAlign w:val="center"/>
+            <w:tcBorders>
+              <w:top w:val="single" w:sz="4" w:color="D9D9D9"/>
+              <w:left w:val="single" w:sz="4" w:color="D9D9D9"/>
+              <w:bottom w:val="single" w:sz="4" w:color="D9D9D9"/>
+              <w:right w:val="single" w:sz="4" w:color="D9D9D9"/>
+            </w:tcBorders>
+            <w:shd w:fill="F3F7FB"/>
+          </w:tcPr>
+          <w:p>
+            <w:r>
+              <w:rPr>
+                <w:sz w:val="18"/>
+              </w:rPr>
+              <w:t>At least one applicable filing is still due today or later.</w:t>
+            </w:r>
+          </w:p>
+        </w:tc>
+      </w:tr>
+      <w:tr>
+        <w:tc>
+          <w:tcPr>
+            <w:tcW w:type="dxa" w:w="5040"/>
+            <w:vAlign w:val="center"/>
+            <w:tcBorders>
+              <w:top w:val="single" w:sz="4" w:color="D9D9D9"/>
+              <w:left w:val="single" w:sz="4" w:color="D9D9D9"/>
+              <w:bottom w:val="single" w:sz="4" w:color="D9D9D9"/>
+              <w:right w:val="single" w:sz="4" w:color="D9D9D9"/>
+            </w:tcBorders>
+          </w:tcPr>
+          <w:p>
+            <w:r>
+              <w:rPr>
+                <w:sz w:val="18"/>
+              </w:rPr>
+              <w:t>Incomplete</w:t>
+            </w:r>
+          </w:p>
+        </w:tc>
+        <w:tc>
+          <w:tcPr>
+            <w:tcW w:type="dxa" w:w="5040"/>
+            <w:vAlign w:val="center"/>
+            <w:tcBorders>
+              <w:top w:val="single" w:sz="4" w:color="D9D9D9"/>
+              <w:left w:val="single" w:sz="4" w:color="D9D9D9"/>
+              <w:bottom w:val="single" w:sz="4" w:color="D9D9D9"/>
+              <w:right w:val="single" w:sz="4" w:color="D9D9D9"/>
+            </w:tcBorders>
+          </w:tcPr>
+          <w:p>
+            <w:r>
+              <w:rPr>
+                <w:sz w:val="18"/>
+              </w:rPr>
+              <w:t>At least one applicable filing is overdue.</w:t>
+            </w:r>
+          </w:p>
+        </w:tc>
+      </w:tr>
+      <w:tr>
+        <w:tc>
+          <w:tcPr>
+            <w:tcW w:type="dxa" w:w="5040"/>
+            <w:vAlign w:val="center"/>
+            <w:tcBorders>
+              <w:top w:val="single" w:sz="4" w:color="D9D9D9"/>
+              <w:left w:val="single" w:sz="4" w:color="D9D9D9"/>
+              <w:bottom w:val="single" w:sz="4" w:color="D9D9D9"/>
+              <w:right w:val="single" w:sz="4" w:color="D9D9D9"/>
+            </w:tcBorders>
+            <w:shd w:fill="F3F7FB"/>
+          </w:tcPr>
+          <w:p>
+            <w:r>
+              <w:rPr>
+                <w:sz w:val="18"/>
+              </w:rPr>
+              <w:t>N/A</w:t>
+            </w:r>
+          </w:p>
+        </w:tc>
+        <w:tc>
+          <w:tcPr>
+            <w:tcW w:type="dxa" w:w="5040"/>
+            <w:vAlign w:val="center"/>
+            <w:tcBorders>
+              <w:top w:val="single" w:sz="4" w:color="D9D9D9"/>
+              <w:left w:val="single" w:sz="4" w:color="D9D9D9"/>
+              <w:bottom w:val="single" w:sz="4" w:color="D9D9D9"/>
+              <w:right w:val="single" w:sz="4" w:color="D9D9D9"/>
+            </w:tcBorders>
+            <w:shd w:fill="F3F7FB"/>
+          </w:tcPr>
+          <w:p>
+            <w:r>
+              <w:rPr>
+                <w:sz w:val="18"/>
+              </w:rPr>
+              <w:t>No obligation applies for the selected year.</w:t>
+            </w:r>
+          </w:p>
+        </w:tc>
+      </w:tr>
+      <w:tr>
+        <w:tc>
+          <w:tcPr>
+            <w:tcW w:type="dxa" w:w="5040"/>
+            <w:vAlign w:val="center"/>
+            <w:tcBorders>
+              <w:top w:val="single" w:sz="4" w:color="D9D9D9"/>
+              <w:left w:val="single" w:sz="4" w:color="D9D9D9"/>
+              <w:bottom w:val="single" w:sz="4" w:color="D9D9D9"/>
+              <w:right w:val="single" w:sz="4" w:color="D9D9D9"/>
+            </w:tcBorders>
+          </w:tcPr>
+          <w:p>
+            <w:r>
+              <w:rPr>
+                <w:sz w:val="18"/>
+              </w:rPr>
+              <w:t>Pulled out</w:t>
+            </w:r>
+          </w:p>
+        </w:tc>
+        <w:tc>
+          <w:tcPr>
+            <w:tcW w:type="dxa" w:w="5040"/>
+            <w:vAlign w:val="center"/>
+            <w:tcBorders>
+              <w:top w:val="single" w:sz="4" w:color="D9D9D9"/>
+              <w:left w:val="single" w:sz="4" w:color="D9D9D9"/>
+              <w:bottom w:val="single" w:sz="4" w:color="D9D9D9"/>
+              <w:right w:val="single" w:sz="4" w:color="D9D9D9"/>
+            </w:tcBorders>
+          </w:tcPr>
+          <w:p>
+            <w:r>
+              <w:rPr>
+                <w:sz w:val="18"/>
+              </w:rPr>
+              <w:t>Service ended; later unfiled periods are excluded.</w:t>
+            </w:r>
+          </w:p>
+        </w:tc>
+      </w:tr>
+    </w:tbl>
+    <w:p/>
+    <w:p>
+      <w:pPr>
+        <w:pStyle w:val="Heading1"/>
+      </w:pPr>
+      <w:r>
+        <w:t>6  Search, risk radar, and history</w:t>
+      </w:r>
+    </w:p>
+    <w:p>
+      <w:r>
+        <w:t>Search by client name or TIN and filter by tax type, business type, status, form, or period. The risk radar groups unfiled obligations into overdue, due today, due within three days, and due within seven days. Selecting a card fills its five-row table; selecting a row opens its filing flow.</w:t>
+      </w:r>
+    </w:p>
+    <w:p>
+      <w:r>
+        <w:t>Year history shows applicable years and a consolidated five-year summary. Filing records and service history remain tied to their original years.</w:t>
       </w:r>
     </w:p>
     <w:p>
@@ -75,12 +1137,12 @@
         <w:pStyle w:val="Heading1"/>
       </w:pPr>
       <w:r>
-        <w:t>3  Set deadline references</w:t>
+        <w:t>7  Reports and Excel transfer</w:t>
       </w:r>
     </w:p>
     <w:p>
       <w:r>
-        <w:t>Open Deadline reference to review a form’s periods and due dates.</w:t>
+        <w:t>Each report asks for a year range and client selection. Use the checklist header to select or clear clients, search the list, then open the preview. Reports support Excel and PDF output.</w:t>
       </w:r>
     </w:p>
     <w:p>
@@ -88,7 +1150,7 @@
         <w:pStyle w:val="ListNumber"/>
       </w:pPr>
       <w:r>
-        <w:t>Choose Add deadline to create a schedule reference.</w:t>
+        <w:t>In Settings, choose Export data and select clients and a filing-year range.</w:t>
       </w:r>
     </w:p>
     <w:p>
@@ -96,7 +1158,7 @@
         <w:pStyle w:val="ListNumber"/>
       </w:pPr>
       <w:r>
-        <w:t>Open an existing form and choose Edit schedule to change dates.</w:t>
+        <w:t>Choose the save location for the Excel workbook.</w:t>
       </w:r>
     </w:p>
     <w:p>
@@ -104,12 +1166,20 @@
         <w:pStyle w:val="ListNumber"/>
       </w:pPr>
       <w:r>
-        <w:t>Confirm the periods and dates, then choose Save schedule.</w:t>
+        <w:t>For import, select a TaxGuard workbook and review the detected clients and years.</w:t>
+      </w:r>
+    </w:p>
+    <w:p>
+      <w:pPr>
+        <w:pStyle w:val="ListNumber"/>
+      </w:pPr>
+      <w:r>
+        <w:t>Select the import scope. Existing matching TINs and filing keys are retained safely.</w:t>
       </w:r>
     </w:p>
     <w:p>
       <w:r>
-        <w:t>Existing values are loaded into the editor. Verify dates against current company filing guidance before relying on them.</w:t>
+        <w:t>Excel transfer includes client profiles and filing information. It excludes accounts and passwords.</w:t>
       </w:r>
     </w:p>
     <w:p>
@@ -117,12 +1187,38 @@
         <w:pStyle w:val="Heading1"/>
       </w:pPr>
       <w:r>
-        <w:t>4  Review obligations</w:t>
+        <w:t>8  Backup, restore, and audit</w:t>
       </w:r>
     </w:p>
     <w:p>
       <w:r>
-        <w:t>Open Compliance tracker and select a tax year. Each selected form is expanded into periods such as Q1, Q2, Q3, Q4, months, or Annual. Search by client or form and filter by status or period.</w:t>
+        <w:t>Backup saves a complete SQLite copy containing clients, filings, accounts, documents, company settings, calendar rules, and audit history. Restore only a trusted TaxGuard database. Integrity is verified and a recovery copy is created before replacement.</w:t>
+      </w:r>
+    </w:p>
+    <w:p>
+      <w:r>
+        <w:t>Successful changes enter an append-only audit log. Administrators can filter by user, action, and date. Passwords and uploaded document contents are excluded from summaries.</w:t>
+      </w:r>
+    </w:p>
+    <w:p>
+      <w:pPr>
+        <w:pStyle w:val="Heading1"/>
+      </w:pPr>
+      <w:r>
+        <w:t>9  Company settings and custom fields</w:t>
+      </w:r>
+    </w:p>
+    <w:p>
+      <w:r>
+        <w:t>Administrators can change the company logo, name, and description. Custom client fields appear in records and the directory. User accounts can be added, edited, deactivated, and assigned a profile picture. Destructive changes require confirmation.</w:t>
+      </w:r>
+    </w:p>
+    <w:p>
+      <w:pPr>
+        <w:pStyle w:val="Heading1"/>
+      </w:pPr>
+      <w:r>
+        <w:t>10  Operational safeguards</w:t>
       </w:r>
     </w:p>
     <w:p>
@@ -130,7 +1226,7 @@
         <w:pStyle w:val="ListBullet"/>
       </w:pPr>
       <w:r>
-        <w:t>Incomplete means no filing has been recorded.</w:t>
+        <w:t>Keep Excel exports, backups, and filing documents private.</w:t>
       </w:r>
     </w:p>
     <w:p>
@@ -138,7 +1234,7 @@
         <w:pStyle w:val="ListBullet"/>
       </w:pPr>
       <w:r>
-        <w:t>Overdue means the obligation is incomplete and past its due date according to the system date.</w:t>
+        <w:t>Create regular full backups and periodically test restoration on a separate copy.</w:t>
       </w:r>
     </w:p>
     <w:p>
@@ -146,104 +1242,7 @@
         <w:pStyle w:val="ListBullet"/>
       </w:pPr>
       <w:r>
-        <w:t>Complete means a filing record has been saved.</w:t>
-      </w:r>
-    </w:p>
-    <w:p>
-      <w:pPr>
-        <w:pStyle w:val="Heading1"/>
-      </w:pPr>
-      <w:r>
-        <w:t>5  Record a filing</w:t>
-      </w:r>
-    </w:p>
-    <w:p>
-      <w:r>
-        <w:t>Record the filing after the company submits the return outside TaxGuard.</w:t>
-      </w:r>
-    </w:p>
-    <w:p>
-      <w:pPr>
-        <w:pStyle w:val="ListNumber"/>
-      </w:pPr>
-      <w:r>
-        <w:t>Find the client, form, and period.</w:t>
-      </w:r>
-    </w:p>
-    <w:p>
-      <w:pPr>
-        <w:pStyle w:val="ListNumber"/>
-      </w:pPr>
-      <w:r>
-        <w:t>Choose Record filing.</w:t>
-      </w:r>
-    </w:p>
-    <w:p>
-      <w:pPr>
-        <w:pStyle w:val="ListNumber"/>
-      </w:pPr>
-      <w:r>
-        <w:t>Enter the actual filing date.</w:t>
-      </w:r>
-    </w:p>
-    <w:p>
-      <w:pPr>
-        <w:pStyle w:val="ListNumber"/>
-      </w:pPr>
-      <w:r>
-        <w:t>Enter the confirmation or reference number.</w:t>
-      </w:r>
-    </w:p>
-    <w:p>
-      <w:pPr>
-        <w:pStyle w:val="ListNumber"/>
-      </w:pPr>
-      <w:r>
-        <w:t>Add optional remarks and choose Save filing.</w:t>
-      </w:r>
-    </w:p>
-    <w:p>
-      <w:r>
-        <w:t>The confirmation/reference number is currently required. After saving, the obligation becomes Complete and appears in Recent filings.</w:t>
-      </w:r>
-    </w:p>
-    <w:p>
-      <w:pPr>
-        <w:pStyle w:val="Heading1"/>
-      </w:pPr>
-      <w:r>
-        <w:t>6  Review a filing</w:t>
-      </w:r>
-    </w:p>
-    <w:p>
-      <w:r>
-        <w:t>Choose View filing on a completed obligation to review its filing date, reference number, and remarks. Use the available edit action to correct a saved filing, then save again.</w:t>
-      </w:r>
-    </w:p>
-    <w:p>
-      <w:pPr>
-        <w:pStyle w:val="Heading1"/>
-      </w:pPr>
-      <w:r>
-        <w:t>7  Use the dashboard</w:t>
-      </w:r>
-    </w:p>
-    <w:p>
-      <w:r>
-        <w:t>Overview summarizes the selected year. Clients in this year counts applicable clients. Filings completed counts saved submissions. Awaiting filing shows remaining work. Overdue obligations shows incomplete work past due. Filing progress by form and Portfolio completion show progress across the workspace. Recent filings lists the latest submissions.</w:t>
-      </w:r>
-    </w:p>
-    <w:p>
-      <w:r>
-        <w:t>Clicking a recent filing opens Client directory with that client filtered and the client detail window open.</w:t>
-      </w:r>
-    </w:p>
-    <w:p>
-      <w:pPr>
-        <w:pStyle w:val="Heading1"/>
-      </w:pPr>
-      <w:r>
-        <w:t>8  Recommended routine</w:t>
+        <w:t>Review the risk radar and overdue list routinely.</w:t>
       </w:r>
     </w:p>
     <w:p>
@@ -251,7 +1250,7 @@
         <w:pStyle w:val="ListBullet"/>
       </w:pPr>
       <w:r>
-        <w:t>Keep each client’s master information and required forms current.</w:t>
+        <w:t>Confirm official deadlines before operational use.</w:t>
       </w:r>
     </w:p>
     <w:p>
@@ -259,44 +1258,7 @@
         <w:pStyle w:val="ListBullet"/>
       </w:pPr>
       <w:r>
-        <w:t>Review deadline references before the filing period.</w:t>
-      </w:r>
-    </w:p>
-    <w:p>
-      <w:pPr>
-        <w:pStyle w:val="ListBullet"/>
-      </w:pPr>
-      <w:r>
-        <w:t>Check Compliance tracker regularly for incomplete and overdue work.</w:t>
-      </w:r>
-    </w:p>
-    <w:p>
-      <w:pPr>
-        <w:pStyle w:val="ListBullet"/>
-      </w:pPr>
-      <w:r>
-        <w:t>Record each submission immediately after filing.</w:t>
-      </w:r>
-    </w:p>
-    <w:p>
-      <w:pPr>
-        <w:pStyle w:val="ListBullet"/>
-      </w:pPr>
-      <w:r>
-        <w:t>Use Recent filings and dashboard totals to find missing records.</w:t>
-      </w:r>
-    </w:p>
-    <w:p>
-      <w:pPr>
-        <w:pStyle w:val="Heading1"/>
-      </w:pPr>
-      <w:r>
-        <w:t>What TaxGuard does not do</w:t>
-      </w:r>
-    </w:p>
-    <w:p>
-      <w:r>
-        <w:t>TaxGuard does not prepare, transmit, or verify returns with BIR. It records the company’s filing activity and calculates status from client assignments, schedule dates, and saved filing records.</w:t>
+        <w:t>Do not close the app during import, restore, or document save.</w:t>
       </w:r>
     </w:p>
     <w:p>
@@ -304,12 +1266,12 @@
         <w:jc w:val="center"/>
       </w:pPr>
       <w:r>
-        <w:t>TaxGuard · Integrated multi-year compliance monitoring</w:t>
+        <w:t>TaxGuard 0.9.2 | Integrated multi-year compliance monitoring</w:t>
       </w:r>
     </w:p>
     <w:sectPr>
       <w:pgSz w:w="12240" w:h="15840"/>
-      <w:pgMar w:top="1440" w:right="1800" w:bottom="1440" w:left="1800" w:header="720" w:footer="720" w:gutter="0"/>
+      <w:pgMar w:top="1008" w:right="1080" w:bottom="936" w:left="1080" w:header="720" w:footer="720" w:gutter="0"/>
       <w:cols w:space="720"/>
       <w:docGrid w:linePitch="360"/>
     </w:sectPr>
@@ -680,10 +1642,13 @@
     <w:name w:val="Normal"/>
     <w:qFormat/>
     <w:rsid w:val="00FC693F"/>
+    <w:pPr>
+      <w:spacing w:after="120"/>
+    </w:pPr>
     <w:rPr>
       <w:rFonts w:ascii="Aptos" w:hAnsi="Aptos"/>
       <w:color w:val="233041"/>
-      <w:sz w:val="22"/>
+      <w:sz w:val="20"/>
     </w:rPr>
   </w:style>
   <w:style w:type="paragraph" w:styleId="Header">
@@ -748,7 +1713,7 @@
       <w:rFonts w:asciiTheme="majorHAnsi" w:eastAsiaTheme="majorEastAsia" w:hAnsiTheme="majorHAnsi" w:cstheme="majorBidi" w:ascii="Aptos" w:hAnsi="Aptos"/>
       <w:b/>
       <w:bCs/>
-      <w:color w:val="0B2743"/>
+      <w:color w:val="000000"/>
       <w:sz w:val="38"/>
       <w:szCs w:val="28"/>
     </w:rPr>
@@ -772,7 +1737,7 @@
       <w:rFonts w:asciiTheme="majorHAnsi" w:eastAsiaTheme="majorEastAsia" w:hAnsiTheme="majorHAnsi" w:cstheme="majorBidi" w:ascii="Aptos" w:hAnsi="Aptos"/>
       <w:b/>
       <w:bCs/>
-      <w:color w:val="0B2743"/>
+      <w:color w:val="000000"/>
       <w:sz w:val="26"/>
       <w:szCs w:val="26"/>
     </w:rPr>
@@ -1036,10 +2001,10 @@
     <w:rPr>
       <w:rFonts w:asciiTheme="majorHAnsi" w:eastAsiaTheme="majorEastAsia" w:hAnsiTheme="majorHAnsi" w:cstheme="majorBidi" w:ascii="Aptos" w:hAnsi="Aptos"/>
       <w:b/>
-      <w:color w:val="0B2743"/>
+      <w:color w:val="000000"/>
       <w:spacing w:val="5"/>
       <w:kern w:val="28"/>
-      <w:sz w:val="56"/>
+      <w:sz w:val="60"/>
       <w:szCs w:val="52"/>
     </w:rPr>
   </w:style>

</xml_diff>